<commit_message>
Apply portfolio review improvements
</commit_message>
<xml_diff>
--- a/downloads/Clark_Gurden_Resume_2026.docx
+++ b/downloads/Clark_Gurden_Resume_2026.docx
@@ -126,7 +126,7 @@
           <w:sz w:val="20"/>
           <w:szCs w:val="20"/>
         </w:rPr>
-        <w:t xml:space="preserve"> owning global positioning and go-to-market for Predator and Acer Nitro gaming hardware. Serves as the bridge between Taiwan engineering and global consumer and gaming communities, translating technical specifications into premium, </w:t>
+        <w:t xml:space="preserve"> leading global English positioning, launch messaging, and content systems for Predator and Acer Nitro gaming hardware. Serves as the bridge between Taiwan engineering and global consumer and gaming communities, translating technical specifications into premium, </w:t>
       </w:r>
       <w:r>
         <w:rPr>
@@ -772,7 +772,7 @@
           <w:sz w:val="20"/>
           <w:szCs w:val="20"/>
         </w:rPr>
-        <w:t>Wrote product summaries and reviewer guides and represented Acer as a keynote and product speaker, giving press, reviewers, and stakeholders consistent, launch-ready product stories for live audiences.</w:t>
+        <w:t>Created product summaries for Predator Atlas 8 and Acer Nitro Blaze Link, created the Predator Atlas 8 reviewer guide, and represented Acer as a keynote and product speaker for press, reviewers, and stakeholders.</w:t>
       </w:r>
     </w:p>
     <w:p>

</xml_diff>

<commit_message>
Add gaming portfolio architecture and evidence guardrails
</commit_message>
<xml_diff>
--- a/downloads/Clark_Gurden_Resume_2026.docx
+++ b/downloads/Clark_Gurden_Resume_2026.docx
@@ -91,92 +91,50 @@
       </w:pPr>
       <w:r>
         <w:rPr>
-          <w:rFonts w:eastAsia="Calibri" w:cs="Calibri"/>
-          <w:b w:val="false"/>
-          <w:bCs w:val="false"/>
-          <w:i w:val="false"/>
-          <w:iCs w:val="false"/>
-          <w:color w:val="222222"/>
-          <w:sz w:val="20"/>
-          <w:szCs w:val="20"/>
+          <w:b w:val="0"/>
+          <w:sz w:val="20"/>
         </w:rPr>
         <w:t xml:space="preserve">Product and brand marketing specialist with </w:t>
       </w:r>
       <w:r>
         <w:rPr>
-          <w:rFonts w:eastAsia="Calibri" w:cs="Calibri"/>
-          <w:b/>
-          <w:bCs/>
-          <w:i w:val="false"/>
-          <w:iCs w:val="false"/>
-          <w:color w:val="222222"/>
-          <w:sz w:val="20"/>
-          <w:szCs w:val="20"/>
+          <w:b/>
+          <w:sz w:val="20"/>
         </w:rPr>
         <w:t>10+ years at Acer HQ</w:t>
       </w:r>
       <w:r>
         <w:rPr>
-          <w:rFonts w:eastAsia="Calibri" w:cs="Calibri"/>
-          <w:b w:val="false"/>
-          <w:bCs w:val="false"/>
-          <w:i w:val="false"/>
-          <w:iCs w:val="false"/>
-          <w:color w:val="222222"/>
-          <w:sz w:val="20"/>
-          <w:szCs w:val="20"/>
-        </w:rPr>
-        <w:t xml:space="preserve"> leading global English positioning, launch messaging, and content systems for Predator and Acer Nitro gaming hardware. Serves as the bridge between Taiwan engineering and global consumer and gaming communities, translating technical specifications into premium, </w:t>
-      </w:r>
-      <w:r>
-        <w:rPr>
-          <w:rFonts w:eastAsia="Calibri" w:cs="Calibri"/>
-          <w:b/>
-          <w:bCs/>
-          <w:i w:val="false"/>
-          <w:iCs w:val="false"/>
-          <w:color w:val="222222"/>
-          <w:sz w:val="20"/>
-          <w:szCs w:val="20"/>
+          <w:b w:val="0"/>
+          <w:sz w:val="20"/>
+        </w:rPr>
+        <w:t xml:space="preserve"> building global English positioning, launch messaging, and content systems for assigned Predator and Acer Nitro gaming-hardware launches through July 2026. Serves as the bridge between Taiwan engineering and global consumer and gaming communities, translating technical specifications into premium, </w:t>
+      </w:r>
+      <w:r>
+        <w:rPr>
+          <w:b/>
+          <w:sz w:val="20"/>
         </w:rPr>
         <w:t>enthusiast-tier</w:t>
       </w:r>
       <w:r>
         <w:rPr>
-          <w:rFonts w:eastAsia="Calibri" w:cs="Calibri"/>
-          <w:b w:val="false"/>
-          <w:bCs w:val="false"/>
-          <w:i w:val="false"/>
-          <w:iCs w:val="false"/>
-          <w:color w:val="222222"/>
-          <w:sz w:val="20"/>
-          <w:szCs w:val="20"/>
-        </w:rPr>
-        <w:t xml:space="preserve"> brand stories across North America, Europe, and Asia. Led brand consistency and launch execution across </w:t>
-      </w:r>
-      <w:r>
-        <w:rPr>
-          <w:rFonts w:eastAsia="Calibri" w:cs="Calibri"/>
-          <w:b/>
-          <w:bCs/>
-          <w:i w:val="false"/>
-          <w:iCs w:val="false"/>
-          <w:color w:val="222222"/>
-          <w:sz w:val="20"/>
-          <w:szCs w:val="20"/>
-        </w:rPr>
-        <w:t>20-30 hardware launches annually</w:t>
-      </w:r>
-      <w:r>
-        <w:rPr>
-          <w:rFonts w:eastAsia="Calibri" w:cs="Calibri"/>
-          <w:b w:val="false"/>
-          <w:bCs w:val="false"/>
-          <w:i w:val="false"/>
-          <w:iCs w:val="false"/>
-          <w:color w:val="222222"/>
-          <w:sz w:val="20"/>
-          <w:szCs w:val="20"/>
+          <w:b w:val="0"/>
+          <w:sz w:val="20"/>
+        </w:rPr>
+        <w:t xml:space="preserve"> brand stories across North America, Europe, and Asia. Supported brand consistency and launch execution across </w:t>
+      </w:r>
+      <w:r>
+        <w:rPr>
+          <w:b/>
+          <w:sz w:val="20"/>
+        </w:rPr>
+        <w:t>20-30 assigned hardware launches annually</w:t>
+      </w:r>
+      <w:r>
+        <w:rPr>
+          <w:b w:val="0"/>
+          <w:sz w:val="20"/>
         </w:rPr>
         <w:t>, spanning laptops, desktops, handhelds, monitors, peripherals, audio, connected devices, and gaming furniture (Predator Thronos), with deep craft in GTM strategy, product naming, and lifecycle content from pre-launch through refresh.</w:t>
       </w:r>
@@ -509,68 +467,24 @@
       </w:pPr>
       <w:r>
         <w:rPr>
-          <w:rFonts w:eastAsia="Calibri" w:cs="Calibri"/>
-          <w:b w:val="false"/>
-          <w:bCs w:val="false"/>
-          <w:i w:val="false"/>
-          <w:iCs w:val="false"/>
-          <w:color w:val="222222"/>
-          <w:sz w:val="20"/>
-          <w:szCs w:val="20"/>
-        </w:rPr>
-        <w:t xml:space="preserve">Led global positioning and launch messaging across </w:t>
-      </w:r>
-      <w:r>
-        <w:rPr>
-          <w:rFonts w:eastAsia="Calibri" w:cs="Calibri"/>
-          <w:b/>
-          <w:bCs/>
-          <w:i w:val="false"/>
-          <w:iCs w:val="false"/>
-          <w:color w:val="222222"/>
-          <w:sz w:val="20"/>
-          <w:szCs w:val="20"/>
-        </w:rPr>
-        <w:t>20-30 hardware releases annually</w:t>
-      </w:r>
-      <w:r>
-        <w:rPr>
-          <w:rFonts w:eastAsia="Calibri" w:cs="Calibri"/>
-          <w:b w:val="false"/>
-          <w:bCs w:val="false"/>
-          <w:i w:val="false"/>
-          <w:iCs w:val="false"/>
-          <w:color w:val="222222"/>
-          <w:sz w:val="20"/>
-          <w:szCs w:val="20"/>
-        </w:rPr>
-        <w:t xml:space="preserve">, holding premium </w:t>
-      </w:r>
-      <w:r>
-        <w:rPr>
-          <w:rFonts w:eastAsia="Calibri" w:cs="Calibri"/>
-          <w:b/>
-          <w:bCs/>
-          <w:i w:val="false"/>
-          <w:iCs w:val="false"/>
-          <w:color w:val="222222"/>
-          <w:sz w:val="20"/>
-          <w:szCs w:val="20"/>
-        </w:rPr>
-        <w:t>enthusiast-tier</w:t>
-      </w:r>
-      <w:r>
-        <w:rPr>
-          <w:rFonts w:eastAsia="Calibri" w:cs="Calibri"/>
-          <w:b w:val="false"/>
-          <w:bCs w:val="false"/>
-          <w:i w:val="false"/>
-          <w:iCs w:val="false"/>
-          <w:color w:val="222222"/>
-          <w:sz w:val="20"/>
-          <w:szCs w:val="20"/>
-        </w:rPr>
-        <w:t xml:space="preserve"> positioning across North America, Europe, and Asia for laptops, desktops, handhelds, monitors, peripherals, audio, connected devices, and gaming furniture.</w:t>
+          <w:b w:val="0"/>
+          <w:sz w:val="20"/>
+        </w:rPr>
+        <w:t xml:space="preserve">Through July 2026, led global English messaging systems across </w:t>
+      </w:r>
+      <w:r>
+        <w:rPr>
+          <w:b/>
+          <w:sz w:val="20"/>
+        </w:rPr>
+        <w:t>20-30 assigned hardware releases annually</w:t>
+      </w:r>
+      <w:r>
+        <w:rPr>
+          <w:b w:val="0"/>
+          <w:sz w:val="20"/>
+        </w:rPr>
+        <w:t xml:space="preserve"> for Predator and Acer Nitro, translating approved claims into product-specific KSP hierarchies, copymasters, disclaimer and claims language, and technical-benefit framing.</w:t>
       </w:r>
     </w:p>
     <w:p>
@@ -611,16 +525,10 @@
       </w:pPr>
       <w:r>
         <w:rPr>
-          <w:rFonts w:eastAsia="Calibri" w:cs="Calibri"/>
-          <w:b w:val="false"/>
-          <w:bCs w:val="false"/>
-          <w:i w:val="false"/>
-          <w:iCs w:val="false"/>
-          <w:color w:val="222222"/>
-          <w:sz w:val="20"/>
-          <w:szCs w:val="20"/>
-        </w:rPr>
-        <w:t>Held distinct Predator premium-gaming and Acer Nitro mainstream-gaming positioning across markets, adapting global messaging while protecting brand consistency, technical accuracy, and legal requirements.</w:t>
+          <w:b w:val="0"/>
+          <w:sz w:val="20"/>
+        </w:rPr>
+        <w:t>Held distinct Predator and Acer Nitro positioning across assigned launches: Helios foregrounded flagship performance, Triton balanced premium performance with portability and creation, and Acer Nitro used benefit-led language to remain approachable without implying compromise.</w:t>
       </w:r>
     </w:p>
     <w:p>
@@ -636,16 +544,10 @@
       </w:pPr>
       <w:r>
         <w:rPr>
-          <w:rFonts w:eastAsia="Calibri" w:cs="Calibri"/>
-          <w:b w:val="false"/>
-          <w:bCs w:val="false"/>
-          <w:i w:val="false"/>
-          <w:iCs w:val="false"/>
-          <w:color w:val="222222"/>
-          <w:sz w:val="20"/>
-          <w:szCs w:val="20"/>
-        </w:rPr>
-        <w:t>Supported the end-to-end launch lifecycle, from pre-launch positioning through launch execution and product refreshes, coordinating with regional teams to localize global campaigns without losing brand consistency.</w:t>
+          <w:b w:val="0"/>
+          <w:sz w:val="20"/>
+        </w:rPr>
+        <w:t>Developed product-specific copymasters and KSP hierarchies across assigned Helios, Triton, Helios Neo / Triton Neo, Predator Orion, Acer Nitro, and Acer Nitro V launches; contribution varied by product, with role and proof priorities adapted to each audience.</w:t>
       </w:r>
     </w:p>
     <w:p>
@@ -919,6 +821,27 @@
           <w:szCs w:val="20"/>
         </w:rPr>
         <w:t>Led the global English copymaster, product summary, reviewer guide, and KSP structure for Predator's new Windows handheld category, translating specifications and brand requirements into launch-ready positioning.</w:t>
+      </w:r>
+    </w:p>
+    <w:p>
+      <w:pPr>
+        <w:pStyle w:val="Normal"/>
+        <w:spacing w:lineRule="auto" w:line="262" w:before="0" w:after="74"/>
+        <w:rPr/>
+      </w:pPr>
+      <w:r>
+        <w:rPr>
+          <w:b/>
+          <w:sz w:val="20"/>
+        </w:rPr>
+        <w:t xml:space="preserve">Predator Helios 18 AI + Triton 14 AI:  </w:t>
+      </w:r>
+      <w:r>
+        <w:rPr>
+          <w:b w:val="0"/>
+          <w:sz w:val="20"/>
+        </w:rPr>
+        <w:t>Built global English copymasters, product-specific KSP hierarchies, claims and disclaimer language, technical-benefit framing, and messaging review of implemented product-page content within assigned launch scope.</w:t>
       </w:r>
     </w:p>
     <w:p>

</xml_diff>

<commit_message>
Expand product marketing portfolio evidence
</commit_message>
<xml_diff>
--- a/downloads/Clark_Gurden_Resume_2026.docx
+++ b/downloads/Clark_Gurden_Resume_2026.docx
@@ -39,7 +39,63 @@
           <w:sz w:val="18"/>
           <w:szCs w:val="18"/>
         </w:rPr>
-        <w:t>Taipei, Taiwan   |   Native English   |   linkedin.com/in/clark-gurden   |   gurden.clark@gmail.com   |   +886 982-513-428</w:t>
+        <w:t xml:space="preserve">Taipei, Taiwan   |   Native English   |   </w:t>
+      </w:r>
+      <w:hyperlink r:id="rId6" w:history="1">
+        <w:r>
+          <w:rPr>
+            <w:rFonts w:eastAsia="Calibri" w:cs="Calibri"/>
+            <w:b w:val="false"/>
+            <w:bCs w:val="false"/>
+            <w:i w:val="false"/>
+            <w:iCs w:val="false"/>
+            <w:color w:val="5A5F66"/>
+            <w:sz w:val="18"/>
+            <w:szCs w:val="18"/>
+          </w:rPr>
+          <w:t>linkedin.com/in/clark-gurden</w:t>
+        </w:r>
+      </w:hyperlink>
+      <w:r>
+        <w:rPr>
+          <w:rFonts w:eastAsia="Calibri" w:cs="Calibri"/>
+          <w:b w:val="false"/>
+          <w:bCs w:val="false"/>
+          <w:i w:val="false"/>
+          <w:iCs w:val="false"/>
+          <w:color w:val="5A5F66"/>
+          <w:sz w:val="18"/>
+          <w:szCs w:val="18"/>
+        </w:rPr>
+        <w:t xml:space="preserve">   |   </w:t>
+      </w:r>
+      <w:hyperlink r:id="rId7" w:history="1">
+        <w:r>
+          <w:rPr>
+            <w:rFonts w:eastAsia="Calibri" w:cs="Calibri"/>
+            <w:b w:val="false"/>
+            <w:bCs w:val="false"/>
+            <w:i w:val="false"/>
+            <w:iCs w:val="false"/>
+            <w:color w:val="5A5F66"/>
+            <w:sz w:val="18"/>
+            <w:szCs w:val="18"/>
+          </w:rPr>
+          <w:t>gurden.clark@gmail.com</w:t>
+        </w:r>
+      </w:hyperlink>
+      <w:r>
+        <w:rPr>
+          <w:rFonts w:eastAsia="Calibri" w:cs="Calibri"/>
+          <w:b w:val="false"/>
+          <w:bCs w:val="false"/>
+          <w:i w:val="false"/>
+          <w:iCs w:val="false"/>
+          <w:color w:val="5A5F66"/>
+          <w:sz w:val="18"/>
+          <w:szCs w:val="18"/>
+        </w:rPr>
+        <w:t xml:space="preserve">   |   +886 982-513-428</w:t>
       </w:r>
     </w:p>
     <w:p>
@@ -63,7 +119,7 @@
     </w:p>
     <w:p>
       <w:pPr>
-        <w:pStyle w:val="Normal"/>
+        <w:pStyle w:val="Heading1"/>
         <w:pBdr>
           <w:bottom w:val="single" w:sz="8" w:space="3" w:color="1F3B5C"/>
         </w:pBdr>
@@ -94,7 +150,7 @@
           <w:b w:val="0"/>
           <w:sz w:val="20"/>
         </w:rPr>
-        <w:t xml:space="preserve">Product and brand marketing specialist with </w:t>
+        <w:t xml:space="preserve">Senior product and brand marketing professional with </w:t>
       </w:r>
       <w:r>
         <w:rPr>
@@ -108,21 +164,20 @@
           <w:b w:val="0"/>
           <w:sz w:val="20"/>
         </w:rPr>
-        <w:t xml:space="preserve"> building global English positioning, launch messaging, and content systems for assigned Predator and Acer Nitro gaming-hardware launches through July 2026. Serves as the bridge between Taiwan engineering and global consumer and gaming communities, translating technical specifications into premium, </w:t>
-      </w:r>
-      <w:r>
-        <w:rPr>
-          <w:b/>
-          <w:sz w:val="20"/>
-        </w:rPr>
-        <w:t>enthusiast-tier</w:t>
+        <w:t xml:space="preserve"> building global English positioning, launch messaging, and content systems for assigned Predator and Acer Nitro gaming-hardware launches through July 2026. Bridged Taiwan engineering and global consumer and gaming audiences. </w:t>
+      </w:r>
+      <w:r>
+        <w:rPr>
+          <w:b/>
+          <w:sz w:val="20"/>
+        </w:rPr>
       </w:r>
       <w:r>
         <w:rPr>
           <w:b w:val="0"/>
           <w:sz w:val="20"/>
         </w:rPr>
-        <w:t xml:space="preserve"> brand stories across North America, Europe, and Asia. Supported brand consistency and launch execution across </w:t>
+        <w:t xml:space="preserve">Supported brand consistency and launch execution across </w:t>
       </w:r>
       <w:r>
         <w:rPr>
@@ -141,7 +196,7 @@
     </w:p>
     <w:p>
       <w:pPr>
-        <w:pStyle w:val="Normal"/>
+        <w:pStyle w:val="Heading1"/>
         <w:pBdr>
           <w:bottom w:val="single" w:sz="8" w:space="3" w:color="1F3B5C"/>
         </w:pBdr>
@@ -361,7 +416,7 @@
     </w:p>
     <w:p>
       <w:pPr>
-        <w:pStyle w:val="Normal"/>
+        <w:pStyle w:val="Heading1"/>
         <w:pBdr>
           <w:bottom w:val="single" w:sz="8" w:space="3" w:color="1F3B5C"/>
         </w:pBdr>
@@ -528,7 +583,7 @@
           <w:b w:val="0"/>
           <w:sz w:val="20"/>
         </w:rPr>
-        <w:t>Held distinct Predator and Acer Nitro positioning across assigned launches: Helios foregrounded flagship performance, Triton balanced premium performance with portability and creation, and Acer Nitro used benefit-led language to remain approachable without implying compromise.</w:t>
+        <w:t>Held distinct Predator and Acer Nitro positioning across assigned launches: Predator Helios foregrounded flagship performance, Predator Triton balanced premium performance with portability and creation, and Acer Nitro used benefit-led language to remain approachable without implying compromise.</w:t>
       </w:r>
     </w:p>
     <w:p>
@@ -547,7 +602,7 @@
           <w:b w:val="0"/>
           <w:sz w:val="20"/>
         </w:rPr>
-        <w:t>Developed product-specific copymasters and KSP hierarchies across assigned Helios, Triton, Helios Neo / Triton Neo, Predator Orion, Acer Nitro, and Acer Nitro V launches; contribution varied by product, with role and proof priorities adapted to each audience.</w:t>
+        <w:t>Developed product-specific copymasters and KSP hierarchies across assigned Predator Helios, Predator Triton, Predator Helios Neo / Predator Triton Neo, Predator Orion, Acer Nitro, and Acer Nitro V launches; contribution varied by product, with role and proof priorities adapted to each audience.</w:t>
       </w:r>
     </w:p>
     <w:p>
@@ -636,20 +691,20 @@
           <w:sz w:val="20"/>
           <w:szCs w:val="20"/>
         </w:rPr>
-        <w:t>Predator Gaming Technology hub</w:t>
-      </w:r>
-      <w:r>
-        <w:rPr>
-          <w:rFonts w:eastAsia="Calibri" w:cs="Calibri"/>
-          <w:b w:val="false"/>
-          <w:bCs w:val="false"/>
-          <w:i w:val="false"/>
-          <w:iCs w:val="false"/>
-          <w:color w:val="222222"/>
-          <w:sz w:val="20"/>
-          <w:szCs w:val="20"/>
-        </w:rPr>
-        <w:t xml:space="preserve"> end-to-end, from information architecture, navigation, and icon system to copy and recurring technology updates including AeroBlade, Graphene TIM, Predator Vox, MagKey, and CycloneX 360 cooling and audio features.</w:t>
+        <w:t>Predator Gaming Technology Hub</w:t>
+      </w:r>
+      <w:r>
+        <w:rPr>
+          <w:rFonts w:eastAsia="Calibri" w:cs="Calibri"/>
+          <w:b w:val="false"/>
+          <w:bCs w:val="false"/>
+          <w:i w:val="false"/>
+          <w:iCs w:val="false"/>
+          <w:color w:val="222222"/>
+          <w:sz w:val="20"/>
+          <w:szCs w:val="20"/>
+        </w:rPr>
+        <w:t xml:space="preserve"> end-to-end, from information architecture, navigation, and icon system to copy and recurring technology updates including Predator AeroBlade, Graphene TIM, Predator Vox, Predator MagKey 4.0, and Predator CycloneX 360 cooling and audio features.</w:t>
       </w:r>
     </w:p>
     <w:p>
@@ -674,7 +729,7 @@
           <w:sz w:val="20"/>
           <w:szCs w:val="20"/>
         </w:rPr>
-        <w:t>Created product summaries for Predator Atlas 8 and Acer Nitro Blaze Link, created the Predator Atlas 8 reviewer guide, and represented Acer as a keynote and product speaker for press, reviewers, and stakeholders.</w:t>
+        <w:t>Created product summaries for Predator Atlas 8 and Acer Nitro Blaze Link, created the Predator Atlas 8 reviewer guide, and presented Predator product stories at Acer global press and launch events in verified appearances in 2019, 2020, 2021, and 2023.</w:t>
       </w:r>
     </w:p>
     <w:p>
@@ -704,7 +759,7 @@
     </w:p>
     <w:p>
       <w:pPr>
-        <w:pStyle w:val="Normal"/>
+        <w:pStyle w:val="Heading1"/>
         <w:pBdr>
           <w:bottom w:val="single" w:sz="8" w:space="3" w:color="1F3B5C"/>
         </w:pBdr>
@@ -741,7 +796,7 @@
           <w:sz w:val="20"/>
           <w:szCs w:val="20"/>
         </w:rPr>
-        <w:t xml:space="preserve">Predator Gaming Furniture (Thronos, Thronos Air + Gaming Chairs):  </w:t>
+        <w:t xml:space="preserve">Predator Gaming Furniture (Predator Thronos, Predator Thronos Air + Gaming Chairs):  </w:t>
       </w:r>
       <w:r>
         <w:rPr>
@@ -834,7 +889,7 @@
           <w:b/>
           <w:sz w:val="20"/>
         </w:rPr>
-        <w:t xml:space="preserve">Predator Helios 18 AI + Triton 14 AI:  </w:t>
+        <w:t xml:space="preserve">Predator Helios 18 AI + Predator Triton 14 AI:  </w:t>
       </w:r>
       <w:r>
         <w:rPr>
@@ -940,12 +995,12 @@
           <w:sz w:val="20"/>
           <w:szCs w:val="20"/>
         </w:rPr>
-        <w:t>Co-developed naming for Predator Helios, Triton, Orion, Galea, Aethon, Cestus, and Bifrost, plus Acer Swift and Spin, carrying selected names through director approval and legal clearance.</w:t>
-      </w:r>
-    </w:p>
-    <w:p>
-      <w:pPr>
-        <w:pStyle w:val="Normal"/>
+        <w:t>Co-developed naming for Predator Helios, Predator Triton, Predator Orion, Predator Galea, Predator Aethon, Predator Cestus, and Predator Bifrost, plus Acer Swift and Acer Spin, carrying selected names through director approval and legal clearance.</w:t>
+      </w:r>
+    </w:p>
+    <w:p>
+      <w:pPr>
+        <w:pStyle w:val="Heading1"/>
         <w:pBdr>
           <w:bottom w:val="single" w:sz="8" w:space="3" w:color="1F3B5C"/>
         </w:pBdr>

</xml_diff>

<commit_message>
Refine public resume evidence wording
</commit_message>
<xml_diff>
--- a/downloads/Clark_Gurden_Resume_2026.docx
+++ b/downloads/Clark_Gurden_Resume_2026.docx
@@ -602,7 +602,7 @@
           <w:b w:val="0"/>
           <w:sz w:val="20"/>
         </w:rPr>
-        <w:t>Developed product-specific copymasters and KSP hierarchies across assigned Predator Helios, Predator Triton, Predator Helios Neo / Predator Triton Neo, Predator Orion, Acer Nitro, and Acer Nitro V launches; contribution varied by product, with role and proof priorities adapted to each audience.</w:t>
+        <w:t>Developed product-specific copymasters and KSP hierarchies across assigned Predator Helios, Predator Triton, Predator Helios Neo / Predator Triton Neo, Predator Orion, Acer Nitro, and Acer Nitro V launches; contribution varied by product, with messaging and proof priorities tailored to each audience and launch.</w:t>
       </w:r>
     </w:p>
     <w:p>
@@ -729,7 +729,7 @@
           <w:sz w:val="20"/>
           <w:szCs w:val="20"/>
         </w:rPr>
-        <w:t>Created product summaries for Predator Atlas 8 and Acer Nitro Blaze Link, created the Predator Atlas 8 reviewer guide, and presented Predator product stories at Acer global press and launch events in verified appearances in 2019, 2020, 2021, and 2023.</w:t>
+        <w:t>Created product summaries for Predator Atlas 8 and Acer Nitro Blaze Link, created the Predator Atlas 8 reviewer guide, and presented Predator product stories at Acer global press and launch events across multiple years, with selected public appearances linked in the portfolio.</w:t>
       </w:r>
     </w:p>
     <w:p>

</xml_diff>